<commit_message>
feat: complete v1.3 audit, 32-state coverage and delivery materials
</commit_message>
<xml_diff>
--- a/entregables/editoriales/100_VOCES_Guion_Narrativo_Editable.docx
+++ b/entregables/editoriales/100_VOCES_Guion_Narrativo_Editable.docx
@@ -140,7 +140,7 @@
     </w:p>
     <w:p>
       <w:r>
-        <w:t>El explorador conserva una selección demostrativa de ocho entidades en 2024: Aguascalientes, Baja California, Chiapas, Ciudad de México, Sonora, Tlaxcala, Veracruz y Yucatán. No representa una muestra probabilística ni un ranking de las treinta y dos entidades. Por ejemplo, Veracruz registra 58,4%, frente a 59,7% nacional: una diferencia de −1,3 pp. Esta comparación no justifica etiquetar a una comunidad como apática o inferir causas individuales.</w:t>
+        <w:t>El explorador reúne las 32 entidades de 2024 con búsqueda y orden alfabético. Las tasas se cotejaron en el Manual CCPC y el Estudio de Participación 2024; las ocho cifras originales se conservaron. Por ejemplo, Veracruz registra 58,4%, frente a 59,7% nacional: una diferencia de −1,3 pp. Esta comparación no justifica etiquetar a una comunidad como apática o inferir causas individuales.</w:t>
       </w:r>
     </w:p>
     <w:p>
@@ -234,12 +234,12 @@
         <w:pStyle w:val="Heading1"/>
       </w:pPr>
       <w:r>
-        <w:t>Sexta escena: una explicación que viaja</w:t>
+        <w:t>Sala en vivo para el aula</w:t>
       </w:r>
     </w:p>
     <w:p>
       <w:r>
-        <w:t>El generador permite preparar una pieza nacional, su complemento, una entidad o un grupo de edad de 2024, y elegir aula, comunidad o redes como contexto. Las salidas previstas en el producto son PNG horizontal de 1200 × 630, publicación de 1080 × 1350 e historia de 1080 × 1920 píxeles, acompañadas de texto accesible. El valor, el año, el alcance y la referencia deben viajar dentro de la imagen; la descripción escrita permite explicar la misma información sin depender de la gráfica.</w:t>
+        <w:t>Una sala compartida permite estimar la tasa de 2024, calcular la diferencia respecto a 2018 y recuperar el dato después de explicarlo. El presentador invita con QR, revela evidencia y controla tres rondas. El servidor guarda respuestas numéricas con identificadores aleatorios temporales; no solicita nombres ni preferencias políticas. Caducan a las dos horas. El resumen describe la sesión y el recuerdo inmediato, no una muestra representativa ni aprendizaje duradero.</w:t>
       </w:r>
     </w:p>
     <w:p>
@@ -247,12 +247,12 @@
         <w:pStyle w:val="Heading1"/>
       </w:pPr>
       <w:r>
-        <w:t>Un cierre sin exageraciones</w:t>
+        <w:t>Lente Ciudadana y cierre</w:t>
       </w:r>
     </w:p>
     <w:p>
       <w:r>
-        <w:t>La persona termina con una afirmación verificable y una pregunta mejor formulada. Por ejemplo: «La participación nacional CCPC de 2024 fue 59,7%; ¿qué fuente y denominador sustentan esa cifra?». El recurso local funciona como respaldo para conectividad limitada y la demostración manual organiza seis escenas en tres minutos. El video local se verifica por separado. El sitio está privado en la cuenta propietaria; el acceso público, los requisitos administrativos y el piloto no se dan por cumplidos.</w:t>
+        <w:t>La Lente extrae texto de una captura en el dispositivo o recibe una afirmación escrita. Permite elegir entre varias cifras y exige confirmar año, ámbito, indicador, signo y unidad. Contrasta con la base local y ofrece fuentes y una ficha PNG; no verifica toda la afirmación ni la autenticidad de la imagen. Los seis capítulos originales, la demo de sala y el contraste de texto tienen respaldo local. Las salas compartidas requieren internet; el acceso público y el piloto siguen pendientes.</w:t>
       </w:r>
     </w:p>
     <w:p>
@@ -333,12 +333,12 @@
         <w:pStyle w:val="Heading1"/>
       </w:pPr>
       <w:r>
-        <w:t>Adaptación institucional y cierre</w:t>
+        <w:t>Adaptación institucional y mantenimiento</w:t>
       </w:r>
     </w:p>
     <w:p>
       <w:r>
-        <w:t>El código estático, los datos agregados, el guion editable y la ficha docente favorecen la revisión y adaptación. La posible incorporación a actividades del INE requeriría validación metodológica, editorial, de accesibilidad y operativa. Actualizar cifras, atender incidencias y mantener materiales requiere responsables. La presentación ejecutiva expone esta viabilidad en diez diapositivas y el pitch reserva dos minutos cincuenta segundos. Frase de cierre: «Los datos ya hablan. Hagamos que se entiendan».</w:t>
+        <w:t>La aplicación combina recursos estáticos con una API y base D1 para salas. Sus datos agregados, guion editable y kit docente permiten revisión. Una adopción institucional requiere validación metodológica, editorial, de accesibilidad y operativa. La presentación mantiene diez diapositivas; el video dura dos minutos cincuenta segundos. Las pruebas automáticas no sustituyen participantes ni dispositivos físicos. El sitio conserva los permisos de su propietario.</w:t>
       </w:r>
     </w:p>
     <w:p>

</xml_diff>